<commit_message>
fix(submission): real ORCIDs, Figure 3 labels, cover letter sync for C&I submission
- ORCID: 0009-0004-3861-7628 (Mustafa Caliskan), 0000-0003-3561-9375 (Prof. Dr. Ali Hakan Isik)
- Figure 3: 'Unquantized Saf FP16' -> 'Pure FP16'; 'Benign Over-Refusal' -> 'Benign Canary Leakage' (aligns with Table 8)
- Cover letter: '1.67% over-refusal penalty' -> 'benign canary leakage'; ORCIDs synced with Title Page
- regenerated all three figures + Title Page + Manuscript + Cover Letter (docx + md)
</commit_message>
<xml_diff>
--- a/docs/CI_COVER_LETTER.docx
+++ b/docs/CI_COVER_LETTER.docx
@@ -190,7 +190,7 @@
           <w:rFonts w:ascii="Times New Roman" w:hAnsi="Times New Roman"/>
           <w:sz w:val="22"/>
         </w:rPr>
-        <w:t>Full-sample (N=101) paired McNemar tests prove quantization invariance (4-bit NF4 vs. uncompressed FP16 exhibit overlapping CIs, p=0.804 on Llama-3.1-8B), while demonstrating that aggressive system prompt hardening leaves 16.83% residual leakage and imposes an unacceptable 1.67% over-refusal penalty on legitimate user traffic.</w:t>
+        <w:t>Full-sample (N=101) paired McNemar tests prove quantization invariance (4-bit NF4 vs. uncompressed FP16 exhibit overlapping CIs, p=0.804 on Llama-3.1-8B), while demonstrating that aggressive system prompt hardening leaves 16.83% residual leakage and imposes an unacceptable 1.67% benign canary leakage on legitimate user traffic.</w:t>
       </w:r>
     </w:p>
     <w:p>
@@ -282,14 +282,14 @@
         <w:br/>
         <w:t>Email: mustafacaliskan@ogr.mehmetakif.edu.tr</w:t>
         <w:br/>
-        <w:t>ORCID: 0009-0004-9407-7424</w:t>
+        <w:t>ORCID: 0009-0004-3861-7628</w:t>
         <w:br/>
         <w:br/>
         <w:t>On behalf of:</w:t>
         <w:br/>
         <w:t>Prof. Dr. Ali Hakan IŞIK (Co-Author &amp; Academic Advisor)</w:t>
         <w:br/>
-        <w:t>Email: hisik@mehmetakif.edu.tr | ORCID: 0000-0001-8473-7717</w:t>
+        <w:t>Email: hisik@mehmetakif.edu.tr | ORCID: 0000-0003-3561-9375</w:t>
       </w:r>
     </w:p>
     <w:sectPr>

</xml_diff>

<commit_message>
chore(sync): full repo-wide sync + final audit - zero residue, all checks pass
Added scripts/docx_to_md.py: MD is now auto-generated from DOCX (single source of truth, cannot drift again)
Fixed: 'Table 1, Table 1' duplication; delta +14.26 -> +14.23 (XLM-R 70.63); Heading 3 numbered as 3.9.1;
abstract trimmed 210 -> 200 words; 'Saf FP16' -> 'Pure FP16' in Tables 9-10; CONFIDENTIAL_PIN_REDACTED -> real DLP tags;
cover letter: quantization invariance -> 'no statistically significant effect', emails corrected
Audit results: 0 fabricated residues (21 patterns), 25/25 refs cited, 24/24 Wilson CIs recomputed OK,
10-model ASR all match, tables 1-10 and figures 1-3 sequential, data tables 10pt, blind review clean,
3 images embedded, page numbers present, 200-word abstract
</commit_message>
<xml_diff>
--- a/docs/CI_COVER_LETTER.docx
+++ b/docs/CI_COVER_LETTER.docx
@@ -190,7 +190,7 @@
           <w:rFonts w:ascii="Times New Roman" w:hAnsi="Times New Roman"/>
           <w:sz w:val="22"/>
         </w:rPr>
-        <w:t>Full-sample (N=101) paired McNemar tests prove quantization invariance (4-bit NF4 vs. uncompressed FP16 exhibit overlapping CIs, p=0.804 on Llama-3.1-8B), while demonstrating that aggressive system prompt hardening leaves 16.83% residual leakage and imposes an unacceptable 1.67% benign canary leakage on legitimate user traffic.</w:t>
+        <w:t>Full-sample (N=101) paired McNemar tests prove the absence of a statistically significant quantization effect (4-bit NF4 vs. uncompressed FP16 exhibit overlapping CIs, p=0.804 on Llama-3.1-8B), while demonstrating that aggressive system prompt hardening leaves 16.83% residual leakage and imposes an unacceptable 1.67% benign canary leakage on legitimate user traffic.</w:t>
       </w:r>
     </w:p>
     <w:p>
@@ -280,7 +280,7 @@
         <w:br/>
         <w:t>15030 Burdur, Türkiye</w:t>
         <w:br/>
-        <w:t>Email: mustafacaliskan@ogr.mehmetakif.edu.tr</w:t>
+        <w:t>Email: 2211404051@ogr.mehmetakif.edu.tr</w:t>
         <w:br/>
         <w:t>ORCID: 0009-0004-3861-7628</w:t>
         <w:br/>
@@ -289,7 +289,7 @@
         <w:br/>
         <w:t>Prof. Dr. Ali Hakan IŞIK (Co-Author &amp; Academic Advisor)</w:t>
         <w:br/>
-        <w:t>Email: hisik@mehmetakif.edu.tr | ORCID: 0000-0003-3561-9375</w:t>
+        <w:t>Email: ahkan@mehmetakif.edu.tr | ORCID: 0000-0003-3561-9375</w:t>
       </w:r>
     </w:p>
     <w:sectPr>

</xml_diff>

<commit_message>
style: remove remaining rigorous/robust/Reviewer-Proof/prove residues from cover letter and manuscript
</commit_message>
<xml_diff>
--- a/docs/CI_COVER_LETTER.docx
+++ b/docs/CI_COVER_LETTER.docx
@@ -140,7 +140,7 @@
           <w:rFonts w:ascii="Times New Roman" w:hAnsi="Times New Roman"/>
           <w:sz w:val="22"/>
         </w:rPr>
-        <w:t>On a rigorously source-disjoint fair 12-language benchmark (N=2,849), NeuralShield demonstrates statistical parity in Macro-F1 with a commercial guardrail (Patronus Wolf Defender: 84.86% vs. 84.23%, overlapping 95% cluster-bootstrap confidence intervals), while achieving higher recall on native non-translated corpora (+34.4 pp on native Turkish; AUC 0.890 vs. 0.631 on native Cyrillic Russian).</w:t>
+        <w:t>On a source-disjoint fair 12-language benchmark (N=2,849), NeuralShield demonstrates statistical parity in Macro-F1 with a commercial guardrail (Patronus Wolf Defender: 84.86% vs. 84.23%, overlapping 95% cluster-bootstrap confidence intervals), while achieving higher recall on native non-translated corpora (+34.4 pp on native Turkish; AUC 0.890 vs. 0.631 on native Cyrillic Russian).</w:t>
       </w:r>
     </w:p>
     <w:p>
@@ -196,14 +196,14 @@
           <w:b/>
           <w:sz w:val="22"/>
         </w:rPr>
-        <w:t xml:space="preserve">• Reviewer-Proof Full-Pool Ablations: </w:t>
+        <w:t xml:space="preserve">• Full-Pool Paired Ablations: </w:t>
       </w:r>
       <w:r>
         <w:rPr>
           <w:rFonts w:ascii="Times New Roman" w:hAnsi="Times New Roman"/>
           <w:sz w:val="22"/>
         </w:rPr>
-        <w:t>Full-sample (N=101) paired McNemar tests prove the absence of a statistically significant quantization effect (4-bit NF4 vs. uncompressed FP16 exhibit overlapping CIs, p=0.804 on Llama-3.1-8B), while demonstrating that aggressive system prompt hardening leaves 16.83% residual leakage and also produces 1.67% benign canary leakage on legitimate user traffic.</w:t>
+        <w:t>Full-sample (N=101) paired McNemar tests find no statistically significant quantization effect (4-bit NF4 vs. uncompressed FP16 exhibit overlapping CIs, p=0.804 on Llama-3.1-8B), while demonstrating that aggressive system prompt hardening leaves 16.83% residual leakage and also produces 1.67% benign canary leakage on legitimate user traffic.</w:t>
       </w:r>
     </w:p>
     <w:p>
@@ -216,7 +216,7 @@
           <w:rFonts w:ascii="Times New Roman" w:hAnsi="Times New Roman"/>
           <w:sz w:val="22"/>
         </w:rPr>
-        <w:t>We believe this manuscript is ideally suited for Computers and Informatics, as it addresses core intersections of computer science, applied machine learning, software security, and robust computational engineering. The work presents both rigorous theoretical evaluation (cluster-bootstrap resampling, exact McNemar tests, Wilson score intervals) and practical systems engineering validated under real-world operational constraints.</w:t>
+        <w:t>We believe this manuscript is ideally suited for Computers and Informatics, as it addresses core intersections of computer science, applied machine learning, software security, and computational engineering. The work presents both statistical evaluation (cluster-bootstrap resampling, exact McNemar tests, Wilson score intervals) and practical systems engineering validated under real-world operational constraints.</w:t>
       </w:r>
     </w:p>
     <w:p>
@@ -256,7 +256,7 @@
         <w:br/>
         <w:t>3. The authors declare no competing financial interests or personal relationships that could have influenced the work.</w:t>
         <w:br/>
-        <w:t>4. All code artifacts, trained ONNX models, benchmark datasets, evaluation harnesses, and full per-item JSON outputs have been open-sourced and archived on GitHub (https://github.com/Mustafa-Caliskan/ai-soc-agent-lab) to guarantee absolute reproducibility.</w:t>
+        <w:t>4. All code artifacts, trained ONNX models, benchmark datasets, evaluation harnesses, and full per-item JSON outputs have been open-sourced and archived on GitHub (https://github.com/Mustafa-Caliskan/ai-soc-agent-lab) to support reproducibility.</w:t>
         <w:br/>
         <w:t>5. Blind review requirements have been fully respected: author names and affiliations have been strictly omitted from the main manuscript (docs/NeuralShield_CI_Manuscript.docx) and provided separately in the Title Page (docs/Title_Page.docx).</w:t>
       </w:r>

</xml_diff>

<commit_message>
feat(title): update manuscript title to 'NeuralShield: A Multilingual Multi-Layer Security Gateway Against Prompt Injection and Data Exfiltration in Large Language Models'
</commit_message>
<xml_diff>
--- a/docs/CI_COVER_LETTER.docx
+++ b/docs/CI_COVER_LETTER.docx
@@ -46,7 +46,7 @@
           <w:b/>
           <w:sz w:val="22"/>
         </w:rPr>
-        <w:t>SUBJECT: Submission of Original Research Article — "NeuralShield: A Multilingual Multi-Layer Application Security Gateway for Large Language Models and Source-Disjoint Fair Evaluation"</w:t>
+        <w:t>SUBJECT: Submission of Original Research Article — "NeuralShield: A Multilingual Multi-Layer Security Gateway Against Prompt Injection and Data Exfiltration in Large Language Models"</w:t>
       </w:r>
     </w:p>
     <w:p>
@@ -72,7 +72,7 @@
           <w:rFonts w:ascii="Times New Roman" w:hAnsi="Times New Roman"/>
           <w:sz w:val="22"/>
         </w:rPr>
-        <w:t>On behalf of my co-author Prof. Dr. Ali Hakan IŞIK and myself, I am pleased to submit our original research manuscript entitled "NeuralShield: A Multilingual Multi-Layer Application Security Gateway for Large Language Models and Source-Disjoint Fair Evaluation" for consideration for publication as a Research Article in Computers and Informatics (C&amp;I).</w:t>
+        <w:t>On behalf of my co-author Prof. Dr. Ali Hakan IŞIK and myself, I am pleased to submit our original research manuscript entitled "NeuralShield: A Multilingual Multi-Layer Security Gateway Against Prompt Injection and Data Exfiltration in Large Language Models" for consideration for publication as a Research Article in Computers and Informatics (C&amp;I).</w:t>
       </w:r>
     </w:p>
     <w:p>

</xml_diff>

<commit_message>
feat(submission): complete C&I action plan (WPs 1-5) with neutralized naming, HF citations, humanized prose and new layered figure
- WP1: replace all EVREN H200 references with generic enterprise H200 cluster wording (body, Table 8, Appendix B, title page funding)
- WP2: add open-source licence statement to 2.3, Dolly-15k HF dataset link, new Deepset [26] reference
- WP3: rewrite abstract and introduction for rhythm, group languages by family, remove LLM connector cliches, sync Appendix B Case 3 to RT_PERSONA_0022
- WP4: re-author figure 1 as layered L0-L5 architecture at 3600x2200 and add three-phase pipeline flow at 3600x2180, both authored in physical points for legible 4.8-8 pt print
- WP5: harden audit_rendered_pages.py (page count, unsplit table check, PDF export) and verify exactly 17 pages with 10 unsplit tables
- fix advisor e-mail to ahakan@mehmetakif.edu.tr in title page and cover letter (docx and md in sync)
</commit_message>
<xml_diff>
--- a/docs/CI_COVER_LETTER.docx
+++ b/docs/CI_COVER_LETTER.docx
@@ -161,7 +161,7 @@
           <w:rFonts w:ascii="Times New Roman" w:hAnsi="Times New Roman"/>
           <w:sz w:val="22"/>
         </w:rPr>
-        <w:t>Empirical red-teaming across 14 diverse LLMs (from 1.5B edge models to Tier-2 enterprise models and Tier-3 flagship models evaluated on TÜBİTAK ULAKBİM EVREN H200 supercomputing infrastructure) blocked all 101 curated in-domain attacks, driving attack success rates (ASR) from up to 40.59% (Mistral-7B-v0.3) to flat 0.00%.</w:t>
+        <w:t>Empirical red-teaming across 14 diverse LLMs (from 1.5B edge models to Tier-2 enterprise models and Tier-3 flagship models evaluated on an Enterprise NVIDIA H200 Supercomputing Cluster) blocked all 101 curated in-domain attacks, driving attack success rates (ASR) from up to 40.59% (Mistral-7B-v0.3) to flat 0.00%.</w:t>
       </w:r>
     </w:p>
     <w:p>
@@ -305,7 +305,7 @@
         <w:br/>
         <w:t>Prof. Dr. Ali Hakan IŞIK (Co-Author &amp; Academic Advisor)</w:t>
         <w:br/>
-        <w:t>Email: ahkan@mehmetakif.edu.tr | ORCID: 0000-0003-3561-9375</w:t>
+        <w:t>Email: ahakan@mehmetakif.edu.tr | ORCID: 0000-0003-3561-9375</w:t>
       </w:r>
     </w:p>
     <w:sectPr>

</xml_diff>